<commit_message>
Sandy & Junior 2027: revisão da Parte 4
Co-Authored-By: Claude Opus 5.5 <noreply@anthropic.com>
Claude-Session: https://claude.ai/code/session_01MJjUEEZrxQDEUifKK2vj9g
</commit_message>
<xml_diff>
--- a/roteiros/sandy-junior-2027/SJ27_Parte4.docx
+++ b/roteiros/sandy-junior-2027/SJ27_Parte4.docx
@@ -143,7 +143,7 @@
         <w:rPr>
           <w:color w:val="C00000"/>
         </w:rPr>
-        <w:t>Guarde esse disco. Quatro músicos gravaram aquele álbum com toda a esperança do mundo. E, poucos anos depois, ele ia virar a lembrança mais dolorosa da vida de Junior. Porque, desses quatro homens, dois não iam estar mais aqui.</w:t>
+        <w:t>Guarde esse disco. Quatro músicos gravaram aquele álbum com toda a esperança do mundo. E, poucos anos depois, ele ia virar uma das lembranças mais dolorosas da vida de Junior. Porque, desses quatro homens, dois não iam estar mais aqui.</w:t>
       </w:r>
     </w:p>
     <w:p>
@@ -231,7 +231,7 @@
         <w:rPr>
           <w:color w:val="C00000"/>
         </w:rPr>
-        <w:t>Naquele mesmo ano, esse lado entrou pela porta da casa dela. Literalmente. E o que o homem disse quando foi encontrado lá dentro é de arrepiar.</w:t>
+        <w:t>Naquele mesmo ano, esse lado entrou pela porta da casa dela. Literalmente. E o que o homem disse quando foi abordado é de arrepiar.</w:t>
       </w:r>
     </w:p>
     <w:p>
@@ -511,7 +511,7 @@
         <w:rPr>
           <w:color w:val="000000"/>
         </w:rPr>
-        <w:t>Para um músico que tinha passado a vida inteira ao lado de Chorão, ouvir isso dos próprios fãs era um peso a mais, num ano que já tinha começado com a morte do parceiro de toda a vida.</w:t>
+        <w:t>Para um músico que tinha começado a carreira ao lado de Chorão, ouvir isso dos próprios fãs era um peso a mais, num ano que já tinha começado com a morte do amigo.</w:t>
       </w:r>
     </w:p>
     <w:p>

</xml_diff>